<commit_message>
DT-002 REV B: regenerate at Q12-ratified calibration, fix recycle-selector bug
Co-Authored-By: Claude Fable 5 <noreply@anthropic.com>
Claude-Session: https://claude.ai/code/session_01KPr3MWsKS1tFJQMhbKPcg3
</commit_message>
<xml_diff>
--- a/wankoe-python-model/dossiers/DT-002/DT-002-Zone11-Sizing-Note.docx
+++ b/wankoe-python-model/dossiers/DT-002/DT-002-Zone11-Sizing-Note.docx
@@ -121,7 +121,7 @@
           <w:color w:val="605E5C"/>
           <w:sz w:val="20"/>
         </w:rPr>
-        <w:t>Internal technical dossier - August 2026 - produced by NOEZYS</w:t>
+        <w:t>Internal technical dossier - REV B, August 2026 - produced by NOEZYS</w:t>
       </w:r>
     </w:p>
     <w:p>
@@ -141,6 +141,192 @@
     <w:p>
       <w:r>
         <w:br w:type="page"/>
+      </w:r>
+    </w:p>
+    <w:p>
+      <w:pPr>
+        <w:pStyle w:val="Heading1"/>
+      </w:pPr>
+      <w:r>
+        <w:t>0. Revision history</w:t>
+      </w:r>
+    </w:p>
+    <w:tbl>
+      <w:tblPr>
+        <w:tblW w:type="auto" w:w="0"/>
+        <w:tblLook w:firstColumn="1" w:firstRow="1" w:lastColumn="0" w:lastRow="0" w:noHBand="0" w:noVBand="1" w:val="04A0"/>
+        <w:tblBorders>
+          <w:top w:val="single" w:sz="4" w:color="B9B6E0"/>
+          <w:left w:val="single" w:sz="4" w:color="B9B6E0"/>
+          <w:bottom w:val="single" w:sz="4" w:color="B9B6E0"/>
+          <w:right w:val="single" w:sz="4" w:color="B9B6E0"/>
+          <w:insideH w:val="single" w:sz="4" w:color="B9B6E0"/>
+          <w:insideV w:val="single" w:sz="4" w:color="B9B6E0"/>
+        </w:tblBorders>
+      </w:tblPr>
+      <w:tblGrid>
+        <w:gridCol w:w="3120"/>
+        <w:gridCol w:w="3120"/>
+        <w:gridCol w:w="3120"/>
+      </w:tblGrid>
+      <w:tr>
+        <w:tc>
+          <w:tcPr>
+            <w:tcW w:type="dxa" w:w="3120"/>
+          </w:tcPr>
+          <w:p>
+            <w:r/>
+            <w:r>
+              <w:rPr>
+                <w:rFonts w:ascii="Aptos" w:hAnsi="Aptos"/>
+                <w:b/>
+                <w:sz w:val="17"/>
+              </w:rPr>
+              <w:t>Rev</w:t>
+            </w:r>
+          </w:p>
+        </w:tc>
+        <w:tc>
+          <w:tcPr>
+            <w:tcW w:type="dxa" w:w="3120"/>
+          </w:tcPr>
+          <w:p>
+            <w:r/>
+            <w:r>
+              <w:rPr>
+                <w:rFonts w:ascii="Aptos" w:hAnsi="Aptos"/>
+                <w:b/>
+                <w:sz w:val="17"/>
+              </w:rPr>
+              <w:t>Date</w:t>
+            </w:r>
+          </w:p>
+        </w:tc>
+        <w:tc>
+          <w:tcPr>
+            <w:tcW w:type="dxa" w:w="3120"/>
+          </w:tcPr>
+          <w:p>
+            <w:r/>
+            <w:r>
+              <w:rPr>
+                <w:rFonts w:ascii="Aptos" w:hAnsi="Aptos"/>
+                <w:b/>
+                <w:sz w:val="17"/>
+              </w:rPr>
+              <w:t>Changes</w:t>
+            </w:r>
+          </w:p>
+        </w:tc>
+      </w:tr>
+      <w:tr>
+        <w:tc>
+          <w:tcPr>
+            <w:tcW w:type="dxa" w:w="3120"/>
+          </w:tcPr>
+          <w:p>
+            <w:r/>
+            <w:r>
+              <w:rPr>
+                <w:rFonts w:ascii="Aptos" w:hAnsi="Aptos"/>
+                <w:b w:val="0"/>
+                <w:sz w:val="17"/>
+              </w:rPr>
+              <w:t>A</w:t>
+            </w:r>
+          </w:p>
+        </w:tc>
+        <w:tc>
+          <w:tcPr>
+            <w:tcW w:type="dxa" w:w="3120"/>
+          </w:tcPr>
+          <w:p>
+            <w:r/>
+            <w:r>
+              <w:rPr>
+                <w:rFonts w:ascii="Aptos" w:hAnsi="Aptos"/>
+                <w:b w:val="0"/>
+                <w:sz w:val="17"/>
+              </w:rPr>
+              <w:t>2026-08-17</w:t>
+            </w:r>
+          </w:p>
+        </w:tc>
+        <w:tc>
+          <w:tcPr>
+            <w:tcW w:type="dxa" w:w="3120"/>
+          </w:tcPr>
+          <w:p>
+            <w:r/>
+            <w:r>
+              <w:rPr>
+                <w:rFonts w:ascii="Aptos" w:hAnsi="Aptos"/>
+                <w:b w:val="0"/>
+                <w:sz w:val="17"/>
+              </w:rPr>
+              <w:t>First issue (calibration epoch A_j 60 / b_j 0.8, pre-Q12).</w:t>
+            </w:r>
+          </w:p>
+        </w:tc>
+      </w:tr>
+      <w:tr>
+        <w:tc>
+          <w:tcPr>
+            <w:tcW w:type="dxa" w:w="3120"/>
+          </w:tcPr>
+          <w:p>
+            <w:r/>
+            <w:r>
+              <w:rPr>
+                <w:rFonts w:ascii="Aptos" w:hAnsi="Aptos"/>
+                <w:b w:val="0"/>
+                <w:sz w:val="17"/>
+              </w:rPr>
+              <w:t>B</w:t>
+            </w:r>
+          </w:p>
+        </w:tc>
+        <w:tc>
+          <w:tcPr>
+            <w:tcW w:type="dxa" w:w="3120"/>
+          </w:tcPr>
+          <w:p>
+            <w:r/>
+            <w:r>
+              <w:rPr>
+                <w:rFonts w:ascii="Aptos" w:hAnsi="Aptos"/>
+                <w:b w:val="0"/>
+                <w:sz w:val="17"/>
+              </w:rPr>
+              <w:t>2026-08-18</w:t>
+            </w:r>
+          </w:p>
+        </w:tc>
+        <w:tc>
+          <w:tcPr>
+            <w:tcW w:type="dxa" w:w="3120"/>
+          </w:tcPr>
+          <w:p>
+            <w:r/>
+            <w:r>
+              <w:rPr>
+                <w:rFonts w:ascii="Aptos" w:hAnsi="Aptos"/>
+                <w:b w:val="0"/>
+                <w:sz w:val="17"/>
+              </w:rPr>
+              <w:t>FINAL for the Bruno exchange. (1) Calibration ratified by the client (Q12, 2026-08-17): A_j 60 -&gt; 65, b_j 0.8 -&gt; 1.5 (expert-book calcite centrals) — every figure regenerated at the ratified defaults. Headline moves vs REV A: CR.5011 t10 5.71 -&gt; 11.11 %, RR n 1.645 -&gt; 1.347 (finer loop product), recirculation 1A 69.3 -&gt; 68.9 t/h, KFS envelope 8.8/82.3/8.9 (still compliant), KFS yield 24.88 -&gt; 23.36 %, zone-1.1 mode-1A hours 1 366.6 -&gt; 1 455.2 h/y, SR.5008 purchase minimum bottom deck 9.6 -&gt; 9.8 m2. If Bruno was configured from REV A, update A_j/b_j and re-read the PSD tables. (2) Correction: REV A section 9 printed the recycle confrontation as 'PFD 125 vs 324 t/h' due to a stream-selection error in the extraction script; the correct engine recycle is ~74 t/h wet (the 324 was the screen feed). Fixed in the script and herein.</w:t>
+            </w:r>
+          </w:p>
+        </w:tc>
+      </w:tr>
+    </w:tbl>
+    <w:p>
+      <w:r>
+        <w:rPr>
+          <w:color w:val="605E5C"/>
+          <w:sz w:val="16"/>
+        </w:rPr>
+        <w:t>This revision table is authored; every figure in it replays from dt002_data.json at the commits stated in the provenance footers.</w:t>
       </w:r>
     </w:p>
     <w:p>
@@ -1286,7 +1472,7 @@
                 <w:b w:val="0"/>
                 <w:sz w:val="17"/>
               </w:rPr>
-              <w:t>60 / 0.8</w:t>
+              <w:t>65 / 1.5</w:t>
             </w:r>
           </w:p>
         </w:tc>
@@ -1302,7 +1488,7 @@
                 <w:b w:val="0"/>
                 <w:sz w:val="17"/>
               </w:rPr>
-              <w:t>[H] pending drop-weight tests (none launched, client 2026-08-16)</w:t>
+              <w:t>RATIFIED defaults (client Q12, 2026-08-17): expert-book calcite centrals, supersede the 60 / 0.8 of REV A; vendor gradation tests are the closing instrument</w:t>
             </w:r>
           </w:p>
         </w:tc>
@@ -1483,7 +1669,7 @@
     </w:p>
     <w:p>
       <w:r>
-        <w:t>The impactor's breakage intensity comes from the rotor speed: specific energy Ecs = v^2 / 7 200 kWh/t (kinetic energy of the tip speed), then the JK-style characteristic t10 = A_j (1 - exp(-b_j Ecs)) with A_j = 60 and b_j = 0.8 [H]. The t10 sets the product curve SHAPE through the RR uniformity n = max(0.65, (30/t10)^0.3): a harder hit (higher t10) gives a flatter (better graded) product. The product curve is then M1's truncated RR with x80 = CSS and that n; power is M2 on the impactor's own F80 to P80. THE LOOP: SR.5008 deck-1 oversize (plus, in mode 1B, the 20/35 cut) feeds CR.5011, whose product returns to the screen feed. The engine solves this recycle as a fixed point, iterating until BOTH the recycled flow rate and its entire curve change by less than the tolerance; all figures in this note are the converged state.</w:t>
+        <w:t>The impactor's breakage intensity comes from the rotor speed: specific energy Ecs = v^2 / 7 200 kWh/t (kinetic energy of the tip speed), then the JK-style characteristic t10 = A_j (1 - exp(-b_j Ecs)) with A_j = 65 and b_j = 1.5 (ratified defaults, client Q12 2026-08-17). The t10 sets the product curve SHAPE through the RR uniformity n = max(0.65, (30/t10)^0.3): a harder hit (higher t10) gives a flatter (better graded) product. The product curve is then M1's truncated RR with x80 = CSS and that n; power is M2 on the impactor's own F80 to P80. THE LOOP: SR.5008 deck-1 oversize (plus, in mode 1B, the 20/35 cut) feeds CR.5011, whose product returns to the screen feed. The engine solves this recycle as a fixed point, iterating until BOTH the recycled flow rate and its entire curve change by less than the tolerance; all figures in this note are the converged state.</w:t>
       </w:r>
     </w:p>
     <w:p>
@@ -1679,7 +1865,7 @@
                 <w:b w:val="0"/>
                 <w:sz w:val="17"/>
               </w:rPr>
-              <w:t>Feed 324.48 t/h wet (301.77 dry); feed context at 35 mm: 53.25 % passing a/2, 22.89 % oversize</w:t>
+              <w:t>Feed 324.12 t/h wet (301.43 dry); feed context at 35 mm: 54.76 % passing a/2, 22.86 % oversize</w:t>
             </w:r>
           </w:p>
         </w:tc>
@@ -1711,7 +1897,7 @@
                 <w:b w:val="0"/>
                 <w:sz w:val="17"/>
               </w:rPr>
-              <w:t>Required areas: top 6.80 m2, bottom 7.15 m2. Purchase minima (client 2026-08-15, RAIN duty): 9.1 / 9.6 m2</w:t>
+              <w:t>Required areas: top 6.80 m2, bottom 7.29 m2. Purchase minima (client 2026-08-15, RAIN duty): 9.1 / 9.8 m2</w:t>
             </w:r>
           </w:p>
         </w:tc>
@@ -1745,7 +1931,7 @@
                 <w:b w:val="0"/>
                 <w:sz w:val="17"/>
               </w:rPr>
-              <w:t>Loop load 74.48 t/h wet of 90 t/h vendor wet rating = 82.8 %; F80 63.02 mm, P80 29.30 mm, CSS 30 mm, v 30 m/s</w:t>
+              <w:t>Loop load 74.12 t/h wet of 90 t/h vendor wet rating = 82.4 %; F80 63.13 mm, P80 28.42 mm, CSS 30 mm, v 30 m/s</w:t>
             </w:r>
           </w:p>
         </w:tc>
@@ -1761,7 +1947,7 @@
                 <w:b w:val="0"/>
                 <w:sz w:val="17"/>
               </w:rPr>
-              <w:t>Ecs 0.125 kWh/t, t10 5.7 %, n 1.65; W 0.233 kWh/t, absorbed 21.5 kW (installed 132 kW)</w:t>
+              <w:t>Ecs 0.125 kWh/t, t10 11.1 %, n 1.35; W 0.245 kWh/t, absorbed 22.5 kW (installed 132 kW)</w:t>
             </w:r>
           </w:p>
         </w:tc>
@@ -1777,7 +1963,7 @@
                 <w:b w:val="0"/>
                 <w:sz w:val="17"/>
               </w:rPr>
-              <w:t>Recirculation 69.27 t/h dry</w:t>
+              <w:t>Recirculation 68.93 t/h dry</w:t>
             </w:r>
           </w:p>
         </w:tc>
@@ -2042,7 +2228,7 @@
                 <w:b w:val="0"/>
                 <w:sz w:val="14"/>
               </w:rPr>
-              <w:t>301.77</w:t>
+              <w:t>301.43</w:t>
             </w:r>
           </w:p>
         </w:tc>
@@ -2058,7 +2244,7 @@
                 <w:b w:val="0"/>
                 <w:sz w:val="14"/>
               </w:rPr>
-              <w:t>69.27</w:t>
+              <w:t>68.93</w:t>
             </w:r>
           </w:p>
         </w:tc>
@@ -2090,7 +2276,7 @@
                 <w:b w:val="0"/>
                 <w:sz w:val="14"/>
               </w:rPr>
-              <w:t>57.85</w:t>
+              <w:t>54.32</w:t>
             </w:r>
           </w:p>
         </w:tc>
@@ -2106,7 +2292,7 @@
                 <w:b w:val="0"/>
                 <w:sz w:val="14"/>
               </w:rPr>
-              <w:t>174.65</w:t>
+              <w:t>178.18</w:t>
             </w:r>
           </w:p>
         </w:tc>
@@ -2122,7 +2308,7 @@
                 <w:b w:val="0"/>
                 <w:sz w:val="14"/>
               </w:rPr>
-              <w:t>69.27</w:t>
+              <w:t>68.93</w:t>
             </w:r>
           </w:p>
         </w:tc>
@@ -2138,7 +2324,7 @@
                 <w:b w:val="0"/>
                 <w:sz w:val="14"/>
               </w:rPr>
-              <w:t>69.27</w:t>
+              <w:t>68.93</w:t>
             </w:r>
           </w:p>
         </w:tc>
@@ -2204,7 +2390,7 @@
                 <w:b w:val="0"/>
                 <w:sz w:val="14"/>
               </w:rPr>
-              <w:t>324.48</w:t>
+              <w:t>324.12</w:t>
             </w:r>
           </w:p>
         </w:tc>
@@ -2220,7 +2406,7 @@
                 <w:b w:val="0"/>
                 <w:sz w:val="14"/>
               </w:rPr>
-              <w:t>74.48</w:t>
+              <w:t>74.12</w:t>
             </w:r>
           </w:p>
         </w:tc>
@@ -2252,7 +2438,7 @@
                 <w:b w:val="0"/>
                 <w:sz w:val="14"/>
               </w:rPr>
-              <w:t>62.20</w:t>
+              <w:t>58.41</w:t>
             </w:r>
           </w:p>
         </w:tc>
@@ -2268,7 +2454,7 @@
                 <w:b w:val="0"/>
                 <w:sz w:val="14"/>
               </w:rPr>
-              <w:t>187.80</w:t>
+              <w:t>191.59</w:t>
             </w:r>
           </w:p>
         </w:tc>
@@ -2284,7 +2470,7 @@
                 <w:b w:val="0"/>
                 <w:sz w:val="14"/>
               </w:rPr>
-              <w:t>74.48</w:t>
+              <w:t>74.12</w:t>
             </w:r>
           </w:p>
         </w:tc>
@@ -2300,7 +2486,7 @@
                 <w:b w:val="0"/>
                 <w:sz w:val="14"/>
               </w:rPr>
-              <w:t>74.48</w:t>
+              <w:t>74.12</w:t>
             </w:r>
           </w:p>
         </w:tc>
@@ -2366,7 +2552,7 @@
                 <w:b w:val="0"/>
                 <w:sz w:val="14"/>
               </w:rPr>
-              <w:t>38.31</w:t>
+              <w:t>38.38</w:t>
             </w:r>
           </w:p>
         </w:tc>
@@ -2382,7 +2568,7 @@
                 <w:b w:val="0"/>
                 <w:sz w:val="14"/>
               </w:rPr>
-              <w:t>63.02</w:t>
+              <w:t>63.13</w:t>
             </w:r>
           </w:p>
         </w:tc>
@@ -2398,7 +2584,7 @@
                 <w:b w:val="0"/>
                 <w:sz w:val="14"/>
               </w:rPr>
-              <w:t>22.41</w:t>
+              <w:t>21.73</w:t>
             </w:r>
           </w:p>
         </w:tc>
@@ -2414,7 +2600,7 @@
                 <w:b w:val="0"/>
                 <w:sz w:val="14"/>
               </w:rPr>
-              <w:t>31.68</w:t>
+              <w:t>31.81</w:t>
             </w:r>
           </w:p>
         </w:tc>
@@ -2430,7 +2616,7 @@
                 <w:b w:val="0"/>
                 <w:sz w:val="14"/>
               </w:rPr>
-              <w:t>14.17</w:t>
+              <w:t>13.82</w:t>
             </w:r>
           </w:p>
         </w:tc>
@@ -2446,7 +2632,7 @@
                 <w:b w:val="0"/>
                 <w:sz w:val="14"/>
               </w:rPr>
-              <w:t>63.02</w:t>
+              <w:t>63.13</w:t>
             </w:r>
           </w:p>
         </w:tc>
@@ -2462,7 +2648,7 @@
                 <w:b w:val="0"/>
                 <w:sz w:val="14"/>
               </w:rPr>
-              <w:t>29.29</w:t>
+              <w:t>28.42</w:t>
             </w:r>
           </w:p>
         </w:tc>
@@ -2528,7 +2714,7 @@
                 <w:b w:val="0"/>
                 <w:sz w:val="14"/>
               </w:rPr>
-              <w:t>0.94</w:t>
+              <w:t>1.05</w:t>
             </w:r>
           </w:p>
         </w:tc>
@@ -2560,7 +2746,7 @@
                 <w:b w:val="0"/>
                 <w:sz w:val="14"/>
               </w:rPr>
-              <w:t>1.22</w:t>
+              <w:t>1.36</w:t>
             </w:r>
           </w:p>
         </w:tc>
@@ -2592,7 +2778,7 @@
                 <w:b w:val="0"/>
                 <w:sz w:val="14"/>
               </w:rPr>
-              <w:t>1.63</w:t>
+              <w:t>1.78</w:t>
             </w:r>
           </w:p>
         </w:tc>
@@ -2624,7 +2810,7 @@
                 <w:b w:val="0"/>
                 <w:sz w:val="14"/>
               </w:rPr>
-              <w:t>0.19</w:t>
+              <w:t>0.66</w:t>
             </w:r>
           </w:p>
         </w:tc>
@@ -2690,7 +2876,7 @@
                 <w:b w:val="0"/>
                 <w:sz w:val="14"/>
               </w:rPr>
-              <w:t>2.40</w:t>
+              <w:t>2.65</w:t>
             </w:r>
           </w:p>
         </w:tc>
@@ -2722,7 +2908,7 @@
                 <w:b w:val="0"/>
                 <w:sz w:val="14"/>
               </w:rPr>
-              <w:t>3.11</w:t>
+              <w:t>3.43</w:t>
             </w:r>
           </w:p>
         </w:tc>
@@ -2754,7 +2940,7 @@
                 <w:b w:val="0"/>
                 <w:sz w:val="14"/>
               </w:rPr>
-              <w:t>4.14</w:t>
+              <w:t>4.48</w:t>
             </w:r>
           </w:p>
         </w:tc>
@@ -2786,7 +2972,7 @@
                 <w:b w:val="0"/>
                 <w:sz w:val="14"/>
               </w:rPr>
-              <w:t>0.60</w:t>
+              <w:t>1.67</w:t>
             </w:r>
           </w:p>
         </w:tc>
@@ -2852,7 +3038,7 @@
                 <w:b w:val="0"/>
                 <w:sz w:val="14"/>
               </w:rPr>
-              <w:t>5.98</w:t>
+              <w:t>6.52</w:t>
             </w:r>
           </w:p>
         </w:tc>
@@ -2884,7 +3070,7 @@
                 <w:b w:val="0"/>
                 <w:sz w:val="14"/>
               </w:rPr>
-              <w:t>7.76</w:t>
+              <w:t>8.45</w:t>
             </w:r>
           </w:p>
         </w:tc>
@@ -2916,7 +3102,7 @@
                 <w:b w:val="0"/>
                 <w:sz w:val="14"/>
               </w:rPr>
-              <w:t>10.33</w:t>
+              <w:t>11.03</w:t>
             </w:r>
           </w:p>
         </w:tc>
@@ -2948,7 +3134,7 @@
                 <w:b w:val="0"/>
                 <w:sz w:val="14"/>
               </w:rPr>
-              <w:t>1.86</w:t>
+              <w:t>4.20</w:t>
             </w:r>
           </w:p>
         </w:tc>
@@ -3014,7 +3200,7 @@
                 <w:b w:val="0"/>
                 <w:sz w:val="14"/>
               </w:rPr>
-              <w:t>18.14</w:t>
+              <w:t>19.43</w:t>
             </w:r>
           </w:p>
         </w:tc>
@@ -3046,7 +3232,7 @@
                 <w:b w:val="0"/>
                 <w:sz w:val="14"/>
               </w:rPr>
-              <w:t>23.54</w:t>
+              <w:t>25.19</w:t>
             </w:r>
           </w:p>
         </w:tc>
@@ -3078,7 +3264,7 @@
                 <w:b w:val="0"/>
                 <w:sz w:val="14"/>
               </w:rPr>
-              <w:t>31.34</w:t>
+              <w:t>32.87</w:t>
             </w:r>
           </w:p>
         </w:tc>
@@ -3110,7 +3296,7 @@
                 <w:b w:val="0"/>
                 <w:sz w:val="14"/>
               </w:rPr>
-              <w:t>8.15</w:t>
+              <w:t>13.73</w:t>
             </w:r>
           </w:p>
         </w:tc>
@@ -3176,7 +3362,7 @@
                 <w:b w:val="0"/>
                 <w:sz w:val="14"/>
               </w:rPr>
-              <w:t>35.54</w:t>
+              <w:t>37.39</w:t>
             </w:r>
           </w:p>
         </w:tc>
@@ -3208,7 +3394,7 @@
                 <w:b w:val="0"/>
                 <w:sz w:val="14"/>
               </w:rPr>
-              <w:t>46.12</w:t>
+              <w:t>48.48</w:t>
             </w:r>
           </w:p>
         </w:tc>
@@ -3240,7 +3426,7 @@
                 <w:b w:val="0"/>
                 <w:sz w:val="14"/>
               </w:rPr>
-              <w:t>61.40</w:t>
+              <w:t>63.26</w:t>
             </w:r>
           </w:p>
         </w:tc>
@@ -3272,7 +3458,7 @@
                 <w:b w:val="0"/>
                 <w:sz w:val="14"/>
               </w:rPr>
-              <w:t>23.35</w:t>
+              <w:t>31.40</w:t>
             </w:r>
           </w:p>
         </w:tc>
@@ -3338,7 +3524,7 @@
                 <w:b w:val="0"/>
                 <w:sz w:val="14"/>
               </w:rPr>
-              <w:t>48.20</w:t>
+              <w:t>49.93</w:t>
             </w:r>
           </w:p>
         </w:tc>
@@ -3370,7 +3556,7 @@
                 <w:b w:val="0"/>
                 <w:sz w:val="14"/>
               </w:rPr>
-              <w:t>62.56</w:t>
+              <w:t>64.73</w:t>
             </w:r>
           </w:p>
         </w:tc>
@@ -3386,7 +3572,7 @@
                 <w:b w:val="0"/>
                 <w:sz w:val="14"/>
               </w:rPr>
-              <w:t>0.24</w:t>
+              <w:t>0.25</w:t>
             </w:r>
           </w:p>
         </w:tc>
@@ -3402,7 +3588,7 @@
                 <w:b w:val="0"/>
                 <w:sz w:val="14"/>
               </w:rPr>
-              <w:t>83.20</w:t>
+              <w:t>84.39</w:t>
             </w:r>
           </w:p>
         </w:tc>
@@ -3434,7 +3620,7 @@
                 <w:b w:val="0"/>
                 <w:sz w:val="14"/>
               </w:rPr>
-              <w:t>40.46</w:t>
+              <w:t>47.99</w:t>
             </w:r>
           </w:p>
         </w:tc>
@@ -3500,7 +3686,7 @@
                 <w:b w:val="0"/>
                 <w:sz w:val="14"/>
               </w:rPr>
-              <w:t>57.91</w:t>
+              <w:t>59.17</w:t>
             </w:r>
           </w:p>
         </w:tc>
@@ -3532,7 +3718,7 @@
                 <w:b w:val="0"/>
                 <w:sz w:val="14"/>
               </w:rPr>
-              <w:t>75.17</w:t>
+              <w:t>76.72</w:t>
             </w:r>
           </w:p>
         </w:tc>
@@ -3548,7 +3734,7 @@
                 <w:b w:val="0"/>
                 <w:sz w:val="14"/>
               </w:rPr>
-              <w:t>8.69</w:t>
+              <w:t>8.77</w:t>
             </w:r>
           </w:p>
         </w:tc>
@@ -3564,7 +3750,7 @@
                 <w:b w:val="0"/>
                 <w:sz w:val="14"/>
               </w:rPr>
-              <w:t>97.18</w:t>
+              <w:t>97.43</w:t>
             </w:r>
           </w:p>
         </w:tc>
@@ -3596,7 +3782,7 @@
                 <w:b w:val="0"/>
                 <w:sz w:val="14"/>
               </w:rPr>
-              <w:t>56.56</w:t>
+              <w:t>62.06</w:t>
             </w:r>
           </w:p>
         </w:tc>
@@ -3662,7 +3848,7 @@
                 <w:b w:val="0"/>
                 <w:sz w:val="14"/>
               </w:rPr>
-              <w:t>65.36</w:t>
+              <w:t>66.09</w:t>
             </w:r>
           </w:p>
         </w:tc>
@@ -3694,7 +3880,7 @@
                 <w:b w:val="0"/>
                 <w:sz w:val="14"/>
               </w:rPr>
-              <w:t>84.80</w:t>
+              <w:t>85.66</w:t>
             </w:r>
           </w:p>
         </w:tc>
@@ -3710,7 +3896,7 @@
                 <w:b w:val="0"/>
                 <w:sz w:val="14"/>
               </w:rPr>
-              <w:t>39.45</w:t>
+              <w:t>39.16</w:t>
             </w:r>
           </w:p>
         </w:tc>
@@ -3726,7 +3912,7 @@
                 <w:b w:val="0"/>
                 <w:sz w:val="14"/>
               </w:rPr>
-              <w:t>99.81</w:t>
+              <w:t>99.83</w:t>
             </w:r>
           </w:p>
         </w:tc>
@@ -3758,7 +3944,7 @@
                 <w:b w:val="0"/>
                 <w:sz w:val="14"/>
               </w:rPr>
-              <w:t>70.16</w:t>
+              <w:t>73.39</w:t>
             </w:r>
           </w:p>
         </w:tc>
@@ -3824,7 +4010,7 @@
                 <w:b w:val="0"/>
                 <w:sz w:val="14"/>
               </w:rPr>
-              <w:t>73.60</w:t>
+              <w:t>73.79</w:t>
             </w:r>
           </w:p>
         </w:tc>
@@ -3840,7 +4026,7 @@
                 <w:b w:val="0"/>
                 <w:sz w:val="14"/>
               </w:rPr>
-              <w:t>2.31</w:t>
+              <w:t>2.18</w:t>
             </w:r>
           </w:p>
         </w:tc>
@@ -3856,7 +4042,7 @@
                 <w:b w:val="0"/>
                 <w:sz w:val="14"/>
               </w:rPr>
-              <w:t>94.83</w:t>
+              <w:t>95.03</w:t>
             </w:r>
           </w:p>
         </w:tc>
@@ -3872,7 +4058,7 @@
                 <w:b w:val="0"/>
                 <w:sz w:val="14"/>
               </w:rPr>
-              <w:t>79.24</w:t>
+              <w:t>78.73</w:t>
             </w:r>
           </w:p>
         </w:tc>
@@ -3888,7 +4074,7 @@
                 <w:b w:val="0"/>
                 <w:sz w:val="14"/>
               </w:rPr>
-              <w:t>99.99</w:t>
+              <w:t>100.00</w:t>
             </w:r>
           </w:p>
         </w:tc>
@@ -3904,7 +4090,7 @@
                 <w:b w:val="0"/>
                 <w:sz w:val="14"/>
               </w:rPr>
-              <w:t>2.31</w:t>
+              <w:t>2.18</w:t>
             </w:r>
           </w:p>
         </w:tc>
@@ -3920,7 +4106,7 @@
                 <w:b w:val="0"/>
                 <w:sz w:val="14"/>
               </w:rPr>
-              <w:t>84.55</w:t>
+              <w:t>85.46</w:t>
             </w:r>
           </w:p>
         </w:tc>
@@ -3986,7 +4172,7 @@
                 <w:b w:val="0"/>
                 <w:sz w:val="14"/>
               </w:rPr>
-              <w:t>77.11</w:t>
+              <w:t>77.14</w:t>
             </w:r>
           </w:p>
         </w:tc>
@@ -4002,7 +4188,7 @@
                 <w:b w:val="0"/>
                 <w:sz w:val="14"/>
               </w:rPr>
-              <w:t>7.41</w:t>
+              <w:t>7.05</w:t>
             </w:r>
           </w:p>
         </w:tc>
@@ -4018,7 +4204,7 @@
                 <w:b w:val="0"/>
                 <w:sz w:val="14"/>
               </w:rPr>
-              <w:t>97.87</w:t>
+              <w:t>97.92</w:t>
             </w:r>
           </w:p>
         </w:tc>
@@ -4034,7 +4220,7 @@
                 <w:b w:val="0"/>
                 <w:sz w:val="14"/>
               </w:rPr>
-              <w:t>91.44</w:t>
+              <w:t>91.09</w:t>
             </w:r>
           </w:p>
         </w:tc>
@@ -4066,7 +4252,7 @@
                 <w:b w:val="0"/>
                 <w:sz w:val="14"/>
               </w:rPr>
-              <w:t>7.41</w:t>
+              <w:t>7.05</w:t>
             </w:r>
           </w:p>
         </w:tc>
@@ -4082,7 +4268,7 @@
                 <w:b w:val="0"/>
                 <w:sz w:val="14"/>
               </w:rPr>
-              <w:t>89.49</w:t>
+              <w:t>89.70</w:t>
             </w:r>
           </w:p>
         </w:tc>
@@ -4148,7 +4334,7 @@
                 <w:b w:val="0"/>
                 <w:sz w:val="14"/>
               </w:rPr>
-              <w:t>81.35</w:t>
+              <w:t>81.27</w:t>
             </w:r>
           </w:p>
         </w:tc>
@@ -4164,7 +4350,7 @@
                 <w:b w:val="0"/>
                 <w:sz w:val="14"/>
               </w:rPr>
-              <w:t>20.37</w:t>
+              <w:t>19.73</w:t>
             </w:r>
           </w:p>
         </w:tc>
@@ -4196,7 +4382,7 @@
                 <w:b w:val="0"/>
                 <w:sz w:val="14"/>
               </w:rPr>
-              <w:t>98.04</w:t>
+              <w:t>97.92</w:t>
             </w:r>
           </w:p>
         </w:tc>
@@ -4228,7 +4414,7 @@
                 <w:b w:val="0"/>
                 <w:sz w:val="14"/>
               </w:rPr>
-              <w:t>20.37</w:t>
+              <w:t>19.73</w:t>
             </w:r>
           </w:p>
         </w:tc>
@@ -4244,7 +4430,7 @@
                 <w:b w:val="0"/>
                 <w:sz w:val="14"/>
               </w:rPr>
-              <w:t>94.54</w:t>
+              <w:t>94.26</w:t>
             </w:r>
           </w:p>
         </w:tc>
@@ -4310,7 +4496,7 @@
                 <w:b w:val="0"/>
                 <w:sz w:val="14"/>
               </w:rPr>
-              <w:t>89.32</w:t>
+              <w:t>89.29</w:t>
             </w:r>
           </w:p>
         </w:tc>
@@ -4326,7 +4512,7 @@
                 <w:b w:val="0"/>
                 <w:sz w:val="14"/>
               </w:rPr>
-              <w:t>53.52</w:t>
+              <w:t>53.23</w:t>
             </w:r>
           </w:p>
         </w:tc>
@@ -4390,7 +4576,7 @@
                 <w:b w:val="0"/>
                 <w:sz w:val="14"/>
               </w:rPr>
-              <w:t>53.52</w:t>
+              <w:t>53.23</w:t>
             </w:r>
           </w:p>
         </w:tc>
@@ -4406,7 +4592,7 @@
                 <w:b w:val="0"/>
                 <w:sz w:val="14"/>
               </w:rPr>
-              <w:t>99.72</w:t>
+              <w:t>99.65</w:t>
             </w:r>
           </w:p>
         </w:tc>
@@ -4472,7 +4658,7 @@
                 <w:b w:val="0"/>
                 <w:sz w:val="14"/>
               </w:rPr>
-              <w:t>95.41</w:t>
+              <w:t>95.40</w:t>
             </w:r>
           </w:p>
         </w:tc>
@@ -4488,7 +4674,7 @@
                 <w:b w:val="0"/>
                 <w:sz w:val="14"/>
               </w:rPr>
-              <w:t>79.98</w:t>
+              <w:t>79.89</w:t>
             </w:r>
           </w:p>
         </w:tc>
@@ -4552,7 +4738,7 @@
                 <w:b w:val="0"/>
                 <w:sz w:val="14"/>
               </w:rPr>
-              <w:t>79.98</w:t>
+              <w:t>79.89</w:t>
             </w:r>
           </w:p>
         </w:tc>
@@ -4650,7 +4836,7 @@
                 <w:b w:val="0"/>
                 <w:sz w:val="14"/>
               </w:rPr>
-              <w:t>92.10</w:t>
+              <w:t>92.06</w:t>
             </w:r>
           </w:p>
         </w:tc>
@@ -4714,7 +4900,7 @@
                 <w:b w:val="0"/>
                 <w:sz w:val="14"/>
               </w:rPr>
-              <w:t>92.10</w:t>
+              <w:t>92.06</w:t>
             </w:r>
           </w:p>
         </w:tc>
@@ -5243,7 +5429,7 @@
     </w:p>
     <w:p>
       <w:r>
-        <w:t>KFS quality check against the kiln envelope (max 30 % below 20 mm, min 55 % in 20/35, max 15 % above 35 mm): below 8.69 %, in cut 82.75 %, above 8.56 %, COMPLIANT. Zone mass balance closes by construction (partition curves conserve mass; the loop is converged).</w:t>
+        <w:t>KFS quality check against the kiln envelope (max 30 % below 20 mm, min 55 % in 20/35, max 15 % above 35 mm): below 8.77 %, in cut 82.32 %, above 8.91 %, COMPLIANT. Zone mass balance closes by construction (partition curves conserve mass; the loop is converged).</w:t>
       </w:r>
     </w:p>
     <w:p>
@@ -5439,7 +5625,7 @@
                 <w:b w:val="0"/>
                 <w:sz w:val="17"/>
               </w:rPr>
-              <w:t>Feed 255.20 t/h wet (237.34 dry); feed context at 35 mm: 62.69 % passing a/2, 17.92 % oversize</w:t>
+              <w:t>Feed 254.51 t/h wet (236.70 dry); feed context at 35 mm: 63.18 % passing a/2, 17.97 % oversize</w:t>
             </w:r>
           </w:p>
         </w:tc>
@@ -5471,7 +5657,7 @@
                 <w:b w:val="0"/>
                 <w:sz w:val="17"/>
               </w:rPr>
-              <w:t>Required areas: top 5.70 m2, bottom 6.55 m2. Purchase minima (client 2026-08-15, RAIN duty): 9.1 / 9.6 m2</w:t>
+              <w:t>Required areas: top 5.68 m2, bottom 6.55 m2. Purchase minima (client 2026-08-15, RAIN duty): 9.1 / 9.8 m2</w:t>
             </w:r>
           </w:p>
         </w:tc>
@@ -5505,7 +5691,7 @@
                 <w:b w:val="0"/>
                 <w:sz w:val="17"/>
               </w:rPr>
-              <w:t>Loop load 83.20 t/h wet of 90 t/h vendor wet rating = 92.4 %; F80 55.63 mm, P80 17.66 mm, CSS 18 mm, v 30 m/s</w:t>
+              <w:t>Loop load 82.51 t/h wet of 90 t/h vendor wet rating = 91.7 %; F80 55.75 mm, P80 17.13 mm, CSS 18 mm, v 30 m/s</w:t>
             </w:r>
           </w:p>
         </w:tc>
@@ -5521,7 +5707,7 @@
                 <w:b w:val="0"/>
                 <w:sz w:val="17"/>
               </w:rPr>
-              <w:t>Ecs 0.125 kWh/t, t10 5.7 %, n 1.65; W 0.412 kWh/t, absorbed 42.5 kW (installed 132 kW)</w:t>
+              <w:t>Ecs 0.125 kWh/t, t10 11.1 %, n 1.35; W 0.427 kWh/t, absorbed 43.7 kW (installed 132 kW)</w:t>
             </w:r>
           </w:p>
         </w:tc>
@@ -5537,7 +5723,7 @@
                 <w:b w:val="0"/>
                 <w:sz w:val="17"/>
               </w:rPr>
-              <w:t>Recirculation 77.38 t/h dry</w:t>
+              <w:t>Recirculation 76.74 t/h dry</w:t>
             </w:r>
           </w:p>
         </w:tc>
@@ -5801,7 +5987,7 @@
                 <w:b w:val="0"/>
                 <w:sz w:val="14"/>
               </w:rPr>
-              <w:t>237.34</w:t>
+              <w:t>236.70</w:t>
             </w:r>
           </w:p>
         </w:tc>
@@ -5817,7 +6003,7 @@
                 <w:b w:val="0"/>
                 <w:sz w:val="14"/>
               </w:rPr>
-              <w:t>42.46</w:t>
+              <w:t>42.47</w:t>
             </w:r>
           </w:p>
         </w:tc>
@@ -5833,7 +6019,7 @@
                 <w:b w:val="0"/>
                 <w:sz w:val="14"/>
               </w:rPr>
-              <w:t>194.88</w:t>
+              <w:t>194.22</w:t>
             </w:r>
           </w:p>
         </w:tc>
@@ -5849,7 +6035,7 @@
                 <w:b w:val="0"/>
                 <w:sz w:val="14"/>
               </w:rPr>
-              <w:t>34.92</w:t>
+              <w:t>34.26</w:t>
             </w:r>
           </w:p>
         </w:tc>
@@ -5881,7 +6067,7 @@
                 <w:b w:val="0"/>
                 <w:sz w:val="14"/>
               </w:rPr>
-              <w:t>77.38</w:t>
+              <w:t>76.74</w:t>
             </w:r>
           </w:p>
         </w:tc>
@@ -5897,7 +6083,7 @@
                 <w:b w:val="0"/>
                 <w:sz w:val="14"/>
               </w:rPr>
-              <w:t>77.38</w:t>
+              <w:t>76.74</w:t>
             </w:r>
           </w:p>
         </w:tc>
@@ -5963,7 +6149,7 @@
                 <w:b w:val="0"/>
                 <w:sz w:val="14"/>
               </w:rPr>
-              <w:t>255.20</w:t>
+              <w:t>254.51</w:t>
             </w:r>
           </w:p>
         </w:tc>
@@ -5979,7 +6165,7 @@
                 <w:b w:val="0"/>
                 <w:sz w:val="14"/>
               </w:rPr>
-              <w:t>45.65</w:t>
+              <w:t>45.67</w:t>
             </w:r>
           </w:p>
         </w:tc>
@@ -5995,7 +6181,7 @@
                 <w:b w:val="0"/>
                 <w:sz w:val="14"/>
               </w:rPr>
-              <w:t>209.55</w:t>
+              <w:t>208.84</w:t>
             </w:r>
           </w:p>
         </w:tc>
@@ -6011,7 +6197,7 @@
                 <w:b w:val="0"/>
                 <w:sz w:val="14"/>
               </w:rPr>
-              <w:t>37.55</w:t>
+              <w:t>36.84</w:t>
             </w:r>
           </w:p>
         </w:tc>
@@ -6043,7 +6229,7 @@
                 <w:b w:val="0"/>
                 <w:sz w:val="14"/>
               </w:rPr>
-              <w:t>83.20</w:t>
+              <w:t>82.51</w:t>
             </w:r>
           </w:p>
         </w:tc>
@@ -6059,7 +6245,7 @@
                 <w:b w:val="0"/>
                 <w:sz w:val="14"/>
               </w:rPr>
-              <w:t>83.20</w:t>
+              <w:t>82.51</w:t>
             </w:r>
           </w:p>
         </w:tc>
@@ -6125,7 +6311,7 @@
                 <w:b w:val="0"/>
                 <w:sz w:val="14"/>
               </w:rPr>
-              <w:t>31.49</w:t>
+              <w:t>31.58</w:t>
             </w:r>
           </w:p>
         </w:tc>
@@ -6141,7 +6327,7 @@
                 <w:b w:val="0"/>
                 <w:sz w:val="14"/>
               </w:rPr>
-              <w:t>65.57</w:t>
+              <w:t>65.56</w:t>
             </w:r>
           </w:p>
         </w:tc>
@@ -6157,7 +6343,7 @@
                 <w:b w:val="0"/>
                 <w:sz w:val="14"/>
               </w:rPr>
-              <w:t>18.93</w:t>
+              <w:t>18.76</w:t>
             </w:r>
           </w:p>
         </w:tc>
@@ -6173,7 +6359,7 @@
                 <w:b w:val="0"/>
                 <w:sz w:val="14"/>
               </w:rPr>
-              <w:t>30.77</w:t>
+              <w:t>30.87</w:t>
             </w:r>
           </w:p>
         </w:tc>
@@ -6189,7 +6375,7 @@
                 <w:b w:val="0"/>
                 <w:sz w:val="14"/>
               </w:rPr>
-              <w:t>13.95</w:t>
+              <w:t>13.51</w:t>
             </w:r>
           </w:p>
         </w:tc>
@@ -6205,7 +6391,7 @@
                 <w:b w:val="0"/>
                 <w:sz w:val="14"/>
               </w:rPr>
-              <w:t>55.63</w:t>
+              <w:t>55.75</w:t>
             </w:r>
           </w:p>
         </w:tc>
@@ -6221,7 +6407,7 @@
                 <w:b w:val="0"/>
                 <w:sz w:val="14"/>
               </w:rPr>
-              <w:t>17.66</w:t>
+              <w:t>17.13</w:t>
             </w:r>
           </w:p>
         </w:tc>
@@ -6287,7 +6473,7 @@
                 <w:b w:val="0"/>
                 <w:sz w:val="14"/>
               </w:rPr>
-              <w:t>0.93</w:t>
+              <w:t>1.21</w:t>
             </w:r>
           </w:p>
         </w:tc>
@@ -6319,7 +6505,7 @@
                 <w:b w:val="0"/>
                 <w:sz w:val="14"/>
               </w:rPr>
-              <w:t>1.13</w:t>
+              <w:t>1.48</w:t>
             </w:r>
           </w:p>
         </w:tc>
@@ -6351,7 +6537,7 @@
                 <w:b w:val="0"/>
                 <w:sz w:val="14"/>
               </w:rPr>
-              <w:t>1.38</w:t>
+              <w:t>1.79</w:t>
             </w:r>
           </w:p>
         </w:tc>
@@ -6383,7 +6569,7 @@
                 <w:b w:val="0"/>
                 <w:sz w:val="14"/>
               </w:rPr>
-              <w:t>0.44</w:t>
+              <w:t>1.30</w:t>
             </w:r>
           </w:p>
         </w:tc>
@@ -6449,7 +6635,7 @@
                 <w:b w:val="0"/>
                 <w:sz w:val="14"/>
               </w:rPr>
-              <w:t>2.43</w:t>
+              <w:t>3.05</w:t>
             </w:r>
           </w:p>
         </w:tc>
@@ -6481,7 +6667,7 @@
                 <w:b w:val="0"/>
                 <w:sz w:val="14"/>
               </w:rPr>
-              <w:t>2.95</w:t>
+              <w:t>3.71</w:t>
             </w:r>
           </w:p>
         </w:tc>
@@ -6513,7 +6699,7 @@
                 <w:b w:val="0"/>
                 <w:sz w:val="14"/>
               </w:rPr>
-              <w:t>3.60</w:t>
+              <w:t>4.51</w:t>
             </w:r>
           </w:p>
         </w:tc>
@@ -6545,7 +6731,7 @@
                 <w:b w:val="0"/>
                 <w:sz w:val="14"/>
               </w:rPr>
-              <w:t>1.37</w:t>
+              <w:t>3.28</w:t>
             </w:r>
           </w:p>
         </w:tc>
@@ -6611,7 +6797,7 @@
                 <w:b w:val="0"/>
                 <w:sz w:val="14"/>
               </w:rPr>
-              <w:t>6.24</w:t>
+              <w:t>7.51</w:t>
             </w:r>
           </w:p>
         </w:tc>
@@ -6643,7 +6829,7 @@
                 <w:b w:val="0"/>
                 <w:sz w:val="14"/>
               </w:rPr>
-              <w:t>7.60</w:t>
+              <w:t>9.15</w:t>
             </w:r>
           </w:p>
         </w:tc>
@@ -6675,7 +6861,7 @@
                 <w:b w:val="0"/>
                 <w:sz w:val="14"/>
               </w:rPr>
-              <w:t>9.25</w:t>
+              <w:t>11.11</w:t>
             </w:r>
           </w:p>
         </w:tc>
@@ -6707,7 +6893,7 @@
                 <w:b w:val="0"/>
                 <w:sz w:val="14"/>
               </w:rPr>
-              <w:t>4.24</w:t>
+              <w:t>8.14</w:t>
             </w:r>
           </w:p>
         </w:tc>
@@ -6773,7 +6959,7 @@
                 <w:b w:val="0"/>
                 <w:sz w:val="14"/>
               </w:rPr>
-              <w:t>20.02</w:t>
+              <w:t>22.49</w:t>
             </w:r>
           </w:p>
         </w:tc>
@@ -6805,7 +6991,7 @@
                 <w:b w:val="0"/>
                 <w:sz w:val="14"/>
               </w:rPr>
-              <w:t>24.38</w:t>
+              <w:t>27.40</w:t>
             </w:r>
           </w:p>
         </w:tc>
@@ -6837,7 +7023,7 @@
                 <w:b w:val="0"/>
                 <w:sz w:val="14"/>
               </w:rPr>
-              <w:t>29.70</w:t>
+              <w:t>33.27</w:t>
             </w:r>
           </w:p>
         </w:tc>
@@ -6869,7 +7055,7 @@
                 <w:b w:val="0"/>
                 <w:sz w:val="14"/>
               </w:rPr>
-              <w:t>17.75</w:t>
+              <w:t>25.34</w:t>
             </w:r>
           </w:p>
         </w:tc>
@@ -6935,7 +7121,7 @@
                 <w:b w:val="0"/>
                 <w:sz w:val="14"/>
               </w:rPr>
-              <w:t>41.30</w:t>
+              <w:t>43.54</w:t>
             </w:r>
           </w:p>
         </w:tc>
@@ -6967,7 +7153,7 @@
                 <w:b w:val="0"/>
                 <w:sz w:val="14"/>
               </w:rPr>
-              <w:t>50.30</w:t>
+              <w:t>53.06</w:t>
             </w:r>
           </w:p>
         </w:tc>
@@ -6999,7 +7185,7 @@
                 <w:b w:val="0"/>
                 <w:sz w:val="14"/>
               </w:rPr>
-              <w:t>61.27</w:t>
+              <w:t>64.42</w:t>
             </w:r>
           </w:p>
         </w:tc>
@@ -7031,7 +7217,7 @@
                 <w:b w:val="0"/>
                 <w:sz w:val="14"/>
               </w:rPr>
-              <w:t>45.70</w:t>
+              <w:t>52.64</w:t>
             </w:r>
           </w:p>
         </w:tc>
@@ -7097,7 +7283,7 @@
                 <w:b w:val="0"/>
                 <w:sz w:val="14"/>
               </w:rPr>
-              <w:t>56.76</w:t>
+              <w:t>57.79</w:t>
             </w:r>
           </w:p>
         </w:tc>
@@ -7129,7 +7315,7 @@
                 <w:b w:val="0"/>
                 <w:sz w:val="14"/>
               </w:rPr>
-              <w:t>69.13</w:t>
+              <w:t>70.42</w:t>
             </w:r>
           </w:p>
         </w:tc>
@@ -7145,7 +7331,7 @@
                 <w:b w:val="0"/>
                 <w:sz w:val="14"/>
               </w:rPr>
-              <w:t>0.37</w:t>
+              <w:t>0.34</w:t>
             </w:r>
           </w:p>
         </w:tc>
@@ -7161,7 +7347,7 @@
                 <w:b w:val="0"/>
                 <w:sz w:val="14"/>
               </w:rPr>
-              <w:t>84.14</w:t>
+              <w:t>85.43</w:t>
             </w:r>
           </w:p>
         </w:tc>
@@ -7177,7 +7363,7 @@
                 <w:b w:val="0"/>
                 <w:sz w:val="14"/>
               </w:rPr>
-              <w:t>0.17</w:t>
+              <w:t>0.15</w:t>
             </w:r>
           </w:p>
         </w:tc>
@@ -7193,7 +7379,7 @@
                 <w:b w:val="0"/>
                 <w:sz w:val="14"/>
               </w:rPr>
-              <w:t>69.71</w:t>
+              <w:t>72.97</w:t>
             </w:r>
           </w:p>
         </w:tc>
@@ -7259,7 +7445,7 @@
                 <w:b w:val="0"/>
                 <w:sz w:val="14"/>
               </w:rPr>
-              <w:t>67.80</w:t>
+              <w:t>67.90</w:t>
             </w:r>
           </w:p>
         </w:tc>
@@ -7291,7 +7477,7 @@
                 <w:b w:val="0"/>
                 <w:sz w:val="14"/>
               </w:rPr>
-              <w:t>82.57</w:t>
+              <w:t>82.75</w:t>
             </w:r>
           </w:p>
         </w:tc>
@@ -7307,7 +7493,7 @@
                 <w:b w:val="0"/>
                 <w:sz w:val="14"/>
               </w:rPr>
-              <w:t>12.57</w:t>
+              <w:t>11.77</w:t>
             </w:r>
           </w:p>
         </w:tc>
@@ -7323,7 +7509,7 @@
                 <w:b w:val="0"/>
                 <w:sz w:val="14"/>
               </w:rPr>
-              <w:t>97.85</w:t>
+              <w:t>97.95</w:t>
             </w:r>
           </w:p>
         </w:tc>
@@ -7339,7 +7525,7 @@
                 <w:b w:val="0"/>
                 <w:sz w:val="14"/>
               </w:rPr>
-              <w:t>5.67</w:t>
+              <w:t>5.26</w:t>
             </w:r>
           </w:p>
         </w:tc>
@@ -7355,7 +7541,7 @@
                 <w:b w:val="0"/>
                 <w:sz w:val="14"/>
               </w:rPr>
-              <w:t>87.39</w:t>
+              <w:t>87.88</w:t>
             </w:r>
           </w:p>
         </w:tc>
@@ -7421,7 +7607,7 @@
                 <w:b w:val="0"/>
                 <w:sz w:val="14"/>
               </w:rPr>
-              <w:t>74.32</w:t>
+              <w:t>74.16</w:t>
             </w:r>
           </w:p>
         </w:tc>
@@ -7453,7 +7639,7 @@
                 <w:b w:val="0"/>
                 <w:sz w:val="14"/>
               </w:rPr>
-              <w:t>90.49</w:t>
+              <w:t>90.35</w:t>
             </w:r>
           </w:p>
         </w:tc>
@@ -7469,7 +7655,7 @@
                 <w:b w:val="0"/>
                 <w:sz w:val="14"/>
               </w:rPr>
-              <w:t>47.45</w:t>
+              <w:t>45.85</w:t>
             </w:r>
           </w:p>
         </w:tc>
@@ -7501,7 +7687,7 @@
                 <w:b w:val="0"/>
                 <w:sz w:val="14"/>
               </w:rPr>
-              <w:t>21.48</w:t>
+              <w:t>20.53</w:t>
             </w:r>
           </w:p>
         </w:tc>
@@ -7517,7 +7703,7 @@
                 <w:b w:val="0"/>
                 <w:sz w:val="14"/>
               </w:rPr>
-              <w:t>95.82</w:t>
+              <w:t>95.49</w:t>
             </w:r>
           </w:p>
         </w:tc>
@@ -7583,7 +7769,7 @@
                 <w:b w:val="0"/>
                 <w:sz w:val="14"/>
               </w:rPr>
-              <w:t>80.00</w:t>
+              <w:t>79.95</w:t>
             </w:r>
           </w:p>
         </w:tc>
@@ -7599,7 +7785,7 @@
                 <w:b w:val="0"/>
                 <w:sz w:val="14"/>
               </w:rPr>
-              <w:t>1.98</w:t>
+              <w:t>2.01</w:t>
             </w:r>
           </w:p>
         </w:tc>
@@ -7615,7 +7801,7 @@
                 <w:b w:val="0"/>
                 <w:sz w:val="14"/>
               </w:rPr>
-              <w:t>97.00</w:t>
+              <w:t>96.99</w:t>
             </w:r>
           </w:p>
         </w:tc>
@@ -7631,7 +7817,7 @@
                 <w:b w:val="0"/>
                 <w:sz w:val="14"/>
               </w:rPr>
-              <w:t>83.29</w:t>
+              <w:t>82.97</w:t>
             </w:r>
           </w:p>
         </w:tc>
@@ -7663,7 +7849,7 @@
                 <w:b w:val="0"/>
                 <w:sz w:val="14"/>
               </w:rPr>
-              <w:t>38.67</w:t>
+              <w:t>38.16</w:t>
             </w:r>
           </w:p>
         </w:tc>
@@ -7745,7 +7931,7 @@
                 <w:b w:val="0"/>
                 <w:sz w:val="14"/>
               </w:rPr>
-              <w:t>82.08</w:t>
+              <w:t>82.03</w:t>
             </w:r>
           </w:p>
         </w:tc>
@@ -7761,7 +7947,7 @@
                 <w:b w:val="0"/>
                 <w:sz w:val="14"/>
               </w:rPr>
-              <w:t>5.86</w:t>
+              <w:t>5.90</w:t>
             </w:r>
           </w:p>
         </w:tc>
@@ -7777,7 +7963,7 @@
                 <w:b w:val="0"/>
                 <w:sz w:val="14"/>
               </w:rPr>
-              <w:t>98.69</w:t>
+              <w:t>98.68</w:t>
             </w:r>
           </w:p>
         </w:tc>
@@ -7793,7 +7979,7 @@
                 <w:b w:val="0"/>
                 <w:sz w:val="14"/>
               </w:rPr>
-              <w:t>92.69</w:t>
+              <w:t>92.55</w:t>
             </w:r>
           </w:p>
         </w:tc>
@@ -7825,7 +8011,7 @@
                 <w:b w:val="0"/>
                 <w:sz w:val="14"/>
               </w:rPr>
-              <w:t>45.04</w:t>
+              <w:t>44.58</w:t>
             </w:r>
           </w:p>
         </w:tc>
@@ -7907,7 +8093,7 @@
                 <w:b w:val="0"/>
                 <w:sz w:val="14"/>
               </w:rPr>
-              <w:t>84.78</w:t>
+              <w:t>84.74</w:t>
             </w:r>
           </w:p>
         </w:tc>
@@ -7923,7 +8109,7 @@
                 <w:b w:val="0"/>
                 <w:sz w:val="14"/>
               </w:rPr>
-              <w:t>16.46</w:t>
+              <w:t>16.49</w:t>
             </w:r>
           </w:p>
         </w:tc>
@@ -7955,7 +8141,7 @@
                 <w:b w:val="0"/>
                 <w:sz w:val="14"/>
               </w:rPr>
-              <w:t>98.12</w:t>
+              <w:t>98.09</w:t>
             </w:r>
           </w:p>
         </w:tc>
@@ -7987,7 +8173,7 @@
                 <w:b w:val="0"/>
                 <w:sz w:val="14"/>
               </w:rPr>
-              <w:t>53.31</w:t>
+              <w:t>52.92</w:t>
             </w:r>
           </w:p>
         </w:tc>
@@ -8069,7 +8255,7 @@
                 <w:b w:val="0"/>
                 <w:sz w:val="14"/>
               </w:rPr>
-              <w:t>90.71</w:t>
+              <w:t>90.68</w:t>
             </w:r>
           </w:p>
         </w:tc>
@@ -8085,7 +8271,7 @@
                 <w:b w:val="0"/>
                 <w:sz w:val="14"/>
               </w:rPr>
-              <w:t>48.14</w:t>
+              <w:t>48.16</w:t>
             </w:r>
           </w:p>
         </w:tc>
@@ -8149,7 +8335,7 @@
                 <w:b w:val="0"/>
                 <w:sz w:val="14"/>
               </w:rPr>
-              <w:t>71.50</w:t>
+              <w:t>71.27</w:t>
             </w:r>
           </w:p>
         </w:tc>
@@ -8231,7 +8417,7 @@
                 <w:b w:val="0"/>
                 <w:sz w:val="14"/>
               </w:rPr>
-              <w:t>95.98</w:t>
+              <w:t>95.97</w:t>
             </w:r>
           </w:p>
         </w:tc>
@@ -8247,7 +8433,7 @@
                 <w:b w:val="0"/>
                 <w:sz w:val="14"/>
               </w:rPr>
-              <w:t>77.53</w:t>
+              <w:t>77.54</w:t>
             </w:r>
           </w:p>
         </w:tc>
@@ -8311,7 +8497,7 @@
                 <w:b w:val="0"/>
                 <w:sz w:val="14"/>
               </w:rPr>
-              <w:t>87.67</w:t>
+              <w:t>87.57</w:t>
             </w:r>
           </w:p>
         </w:tc>
@@ -8473,7 +8659,7 @@
                 <w:b w:val="0"/>
                 <w:sz w:val="14"/>
               </w:rPr>
-              <w:t>95.14</w:t>
+              <w:t>95.10</w:t>
             </w:r>
           </w:p>
         </w:tc>
@@ -9205,7 +9391,7 @@
                 <w:b w:val="0"/>
                 <w:sz w:val="17"/>
               </w:rPr>
-              <w:t>Mode-1B loop at 83.20 t/h wet against the 90 t/h wet vendor rating (92.4 %); mode-1A at 82.8 %</w:t>
+              <w:t>Mode-1B loop at 82.51 t/h wet against the 90 t/h wet vendor rating (91.7 %); mode-1A at 82.4 %</w:t>
             </w:r>
           </w:p>
         </w:tc>
@@ -9237,7 +9423,7 @@
     </w:p>
     <w:p>
       <w:r>
-        <w:t>Principle (project rule): OPERATING HOURS ARE SET BY THE PRODUCTION TARGETS, never the reverse. Zone 1.1 runs a Saturday-extended single shift (ceiling 2 400 h/y). At the current plan the zone needs 1 366.6 h of mode 1A and 0.0 h of mode 1B: the 0/20 demand of the downstream zones is currently covered by the 1A co-product, so no dedicated 1B campaign is scheduled; the AUTO-1B rule (KFS is NEVER over-produced) would create 1B hours automatically if the 0/20 demand grew beyond the 1A co-production.</w:t>
+        <w:t>Principle (project rule): OPERATING HOURS ARE SET BY THE PRODUCTION TARGETS, never the reverse. Zone 1.1 runs a Saturday-extended single shift (ceiling 2 400 h/y). At the current plan the zone needs 1 455.2 h of mode 1A and 0.0 h of mode 1B: the 0/20 demand of the downstream zones is currently covered by the 1A co-product, so no dedicated 1B campaign is scheduled; the AUTO-1B rule (KFS is NEVER over-produced) would create 1B hours automatically if the 0/20 demand grew beyond the 1A co-production.</w:t>
       </w:r>
     </w:p>
     <w:tbl>
@@ -9354,7 +9540,7 @@
                 <w:b w:val="0"/>
                 <w:sz w:val="17"/>
               </w:rPr>
-              <w:t>141 929 t (incl. 0/20 conversion, client rule 2026-08-16)</w:t>
+              <w:t>164 093 t (incl. 0/20 conversion, client rule 2026-08-16)</w:t>
             </w:r>
           </w:p>
         </w:tc>
@@ -9456,7 +9642,7 @@
                 <w:b w:val="0"/>
                 <w:sz w:val="17"/>
               </w:rPr>
-              <w:t>6 687 t (incl. zone-1.3 dedusting dust, client rule 2026-08-16)</w:t>
+              <w:t>6 684 t (incl. zone-1.3 dedusting dust, client rule 2026-08-16)</w:t>
             </w:r>
           </w:p>
         </w:tc>
@@ -9524,7 +9710,7 @@
                 <w:b w:val="0"/>
                 <w:sz w:val="17"/>
               </w:rPr>
-              <w:t>24.88 % / 24.88 % (equal by construction since the conversion rule)</w:t>
+              <w:t>23.36 % / 23.36 % (equal by construction since the conversion rule)</w:t>
             </w:r>
           </w:p>
         </w:tc>
@@ -9756,7 +9942,7 @@
                 <w:b w:val="0"/>
                 <w:sz w:val="17"/>
               </w:rPr>
-              <w:t>62</w:t>
+              <w:t>58</w:t>
             </w:r>
           </w:p>
         </w:tc>
@@ -9806,7 +9992,7 @@
                 <w:b w:val="0"/>
                 <w:sz w:val="17"/>
               </w:rPr>
-              <w:t>188</w:t>
+              <w:t>192</w:t>
             </w:r>
           </w:p>
         </w:tc>
@@ -9856,7 +10042,7 @@
                 <w:b w:val="0"/>
                 <w:sz w:val="17"/>
               </w:rPr>
-              <w:t>324</w:t>
+              <w:t>74</w:t>
             </w:r>
           </w:p>
         </w:tc>
@@ -9914,12 +10100,12 @@
     </w:tbl>
     <w:p>
       <w:r>
-        <w:t>PFD scenario A: KFS 80 t/h vs engine ~62 t/h; crude 170 vs ~188 — the PFD figures assume the NACO DESIGN feed curve; the engine runs the MEASURED belt-cut curve (45.5 % already &lt; 20 mm at the pivot). Same flowsheet, different feed curve: the gap is a FEED-CURVE question, not a flowsheet disagreement (same family as the KFS 80-vs-51 spec question).</w:t>
+        <w:t>PFD scenario A: KFS 80 t/h vs engine ~58 t/h; crude 170 vs ~192 — the PFD figures assume the NACO DESIGN feed curve; the engine runs the MEASURED belt-cut curve (45.5 % already &lt; 20 mm at the pivot). Same flowsheet, different feed curve: the gap is a FEED-CURVE question, not a flowsheet disagreement (same family as the KFS 80-vs-51 spec question).</w:t>
       </w:r>
     </w:p>
     <w:p>
       <w:r>
-        <w:t>PFD screen feed 350 t/h vs engine 324 t/h and PFD recycle 125 vs 324 — consistent with the finer measured feed (less +35 oversize, less recycle).</w:t>
+        <w:t>PFD screen feed 350 t/h vs engine 324 t/h and PFD recycle 125 vs 74 — consistent with the finer measured feed (less +35 oversize, less recycle).</w:t>
       </w:r>
     </w:p>
     <w:p>
@@ -9942,7 +10128,7 @@
     </w:p>
     <w:p>
       <w:r>
-        <w:t>Engine commit 27a64f0; scenario: modes 1A (250 t/h wet) + 1B (172.0 t/h wet, CSS 18), measured 2026-08-08 belt-cut feed, dry weather, reference settings g60/CSS30/v30. Replay without any assistant: PYTHONPATH=src python dossiers/DT-002/extract_dt002.py (regenerates dt002_data.json), then PYTHONPATH=src python dossiers/DT-002/render_dt002.py (regenerates this note and the Word document from that JSON). Every figure in this note comes from that JSON; none is hand-typed. The PFD is archived alongside (SHA-256 4c2cd3a447744542a0fb981e8e14bb9b50f4bab373da26a425824fb455f0275f, byte-identical to the 2026-08-12 docs/pfd/ archive). Declared hypotheses [H] remain hypotheses: no external test campaign has been launched (client decision 2026-08-16). Produced by NOEZYS.</w:t>
+        <w:t>Engine commit e485561; scenario: modes 1A (250 t/h wet) + 1B (172.0 t/h wet, CSS 18), measured 2026-08-08 belt-cut feed, dry weather, reference settings g60/CSS30/v30. Replay without any assistant: PYTHONPATH=src python dossiers/DT-002/extract_dt002.py (regenerates dt002_data.json), then PYTHONPATH=src python dossiers/DT-002/render_dt002.py (regenerates this note and the Word document from that JSON). Every figure in this note comes from that JSON; none is hand-typed. The PFD is archived alongside (SHA-256 4c2cd3a447744542a0fb981e8e14bb9b50f4bab373da26a425824fb455f0275f, byte-identical to the 2026-08-12 docs/pfd/ archive). Declared hypotheses [H] remain hypotheses: no external test campaign has been launched (client decision 2026-08-16). Produced by NOEZYS.</w:t>
       </w:r>
     </w:p>
     <w:sectPr>

</xml_diff>